<commit_message>
Resume: CYBERSEC hiring Summer Intern @ Unknown (unknown)
</commit_message>
<xml_diff>
--- a/resumes/Resume_CYBERSEC_hiring_Summer_Intern_Unknown__unknown_.docx
+++ b/resumes/Resume_CYBERSEC_hiring_Summer_Intern_Unknown__unknown_.docx
@@ -430,7 +430,7 @@
           <w:sz w:val="19"/>
           <w:szCs w:val="19"/>
         </w:rPr>
-        <w:t>Triaged 50+ weekly inventory reimbursement cases by severity and policy eligibility, translating high-volume case review into structured investigation, escalation, and evidence documentation.</w:t>
+        <w:t>Triaged 50+ weekly inventory reimbursement cases by severity and policy eligibility, following structured case triage and escalation workflows, resulting in timely decision-making.</w:t>
       </w:r>
     </w:p>
     <w:p>
@@ -449,7 +449,7 @@
           <w:sz w:val="19"/>
           <w:szCs w:val="19"/>
         </w:rPr>
-        <w:t>Conducted root cause analysis on seller claims, identifying policy violations and anomalous patterns for pattern review and investigation handoffs.</w:t>
+        <w:t>Investigated root cause analysis on seller claims, identifying policy violations and anomalous patterns, and escalated findings to senior reviewers, reducing repeat-issue investigation time.</w:t>
       </w:r>
     </w:p>
     <w:p>
@@ -468,7 +468,7 @@
           <w:sz w:val="19"/>
           <w:szCs w:val="19"/>
         </w:rPr>
-        <w:t>Maintained audit-ready case documentation with findings, decisions, evidence notes, and corrective actions aligned to evidence documentation and decision trails.</w:t>
+        <w:t>Analyzed 200+ weekly cases to spot recurring fraud patterns and flagged them early, resulting in a reduction of repeat-issue investigation time before escalation.</w:t>
       </w:r>
     </w:p>
     <w:p>
@@ -487,7 +487,7 @@
           <w:sz w:val="19"/>
           <w:szCs w:val="19"/>
         </w:rPr>
-        <w:t>Spotted recurring fraud patterns across 200+ weekly cases and flagged repeat issues early, reducing investigation cycles before escalation.</w:t>
+        <w:t>Documented audit-ready case records, including investigation findings, decisions, evidence notes, and corrective actions, ensuring transparency and accountability.</w:t>
       </w:r>
     </w:p>
     <w:p>
@@ -588,7 +588,7 @@
           <w:sz w:val="19"/>
           <w:szCs w:val="19"/>
         </w:rPr>
-        <w:t>Deployed Splunk SIEM with SPL correlation searches for brute-force detection, lateral movement, and privilege escalation, mapped to MITRE ATT&amp;CK TTPs and created PICERL incident reports.</w:t>
+        <w:t>Deployed Splunk SIEM with SPL searches for brute-force detection, lateral movement, and privilege escalation; mapped TTPs to MITRE ATT&amp;CK and wrote PICERL incident report.</w:t>
       </w:r>
     </w:p>
     <w:p>
@@ -626,7 +626,7 @@
           <w:sz w:val="19"/>
           <w:szCs w:val="19"/>
         </w:rPr>
-        <w:t>Converted detection logic to Sigma rules (detection-as-code) for enterprise SOCs; analyzed TCP/IP traffic in Wireshark for SYN scans, DNS tunnelling, and plaintext credential exposure.</w:t>
+        <w:t>Converted detection logic to Sigma rules, enhancing vendor-neutral detection-as-code for enterprise SOCs; analyzed TCP/IP traffic in Wireshark for SYN scans, DNS tunnelling, and plaintext credential exposure.</w:t>
       </w:r>
     </w:p>
     <w:p>
@@ -716,7 +716,7 @@
           <w:sz w:val="19"/>
           <w:szCs w:val="19"/>
         </w:rPr>
-        <w:t>Developed OWASP Top 10 automated web checker to detect injection, auth, and SSRF vulnerabilities, documenting SQL injection exploit and remediation.</w:t>
+        <w:t>Developed OWASP Top 10 automated web checker to detect injection, auth, and SSRF vulnerabilities; documented SQL injection remediation.</w:t>
       </w:r>
     </w:p>
     <w:p>

</xml_diff>